<commit_message>
inserted working server image
</commit_message>
<xml_diff>
--- a/Lab-0-Report.docx
+++ b/Lab-0-Report.docx
@@ -1407,21 +1407,18 @@
     </w:p>
     <w:p>
       <w:pPr>
-        <w:rPr>
-          <w:lang w:val="en-US"/>
-        </w:rPr>
-      </w:pPr>
-    </w:p>
-    <w:p>
-      <w:pPr>
-        <w:rPr>
-          <w:b/>
-          <w:bCs/>
-          <w:lang w:val="en-US"/>
-        </w:rPr>
-      </w:pPr>
-      <w:r>
-        <w:rPr>
+        <w:spacing w:after="0"/>
+        <w:jc w:val="both"/>
+        <w:rPr>
+          <w:rFonts w:ascii="Times New Roman" w:hAnsi="Times New Roman" w:cs="Times New Roman"/>
+          <w:b/>
+          <w:bCs/>
+          <w:lang w:val="en-US"/>
+        </w:rPr>
+      </w:pPr>
+      <w:r>
+        <w:rPr>
+          <w:rFonts w:ascii="Times New Roman" w:hAnsi="Times New Roman" w:cs="Times New Roman"/>
           <w:b/>
           <w:bCs/>
           <w:lang w:val="en-US"/>
@@ -1431,18 +1428,23 @@
     </w:p>
     <w:p>
       <w:pPr>
-        <w:rPr>
-          <w:lang w:val="en-US"/>
-        </w:rPr>
-      </w:pPr>
-      <w:r>
-        <w:rPr>
+        <w:spacing w:after="0"/>
+        <w:jc w:val="both"/>
+        <w:rPr>
+          <w:rFonts w:ascii="Times New Roman" w:hAnsi="Times New Roman" w:cs="Times New Roman"/>
+          <w:lang w:val="en-US"/>
+        </w:rPr>
+      </w:pPr>
+      <w:r>
+        <w:rPr>
+          <w:rFonts w:ascii="Times New Roman" w:hAnsi="Times New Roman" w:cs="Times New Roman"/>
           <w:lang w:val="en-US"/>
         </w:rPr>
         <w:t xml:space="preserve">After logging in, we checked and confirmed that our SSH keys were properly added. We also changed the default shell to </w:t>
       </w:r>
       <w:r>
         <w:rPr>
+          <w:rFonts w:ascii="Times New Roman" w:hAnsi="Times New Roman" w:cs="Times New Roman"/>
           <w:b/>
           <w:bCs/>
           <w:lang w:val="en-US"/>
@@ -1451,6 +1453,7 @@
       </w:r>
       <w:r>
         <w:rPr>
+          <w:rFonts w:ascii="Times New Roman" w:hAnsi="Times New Roman" w:cs="Times New Roman"/>
           <w:lang w:val="en-US"/>
         </w:rPr>
         <w:t>, as recommended for running scripts. This step ensures compatibility with most project scripts.</w:t>
@@ -1458,21 +1461,98 @@
     </w:p>
     <w:p>
       <w:pPr>
-        <w:rPr>
-          <w:lang w:val="en-US"/>
-        </w:rPr>
-      </w:pPr>
-    </w:p>
-    <w:p>
-      <w:pPr>
-        <w:rPr>
-          <w:b/>
-          <w:bCs/>
-          <w:lang w:val="en-US"/>
-        </w:rPr>
-      </w:pPr>
-      <w:r>
-        <w:rPr>
+        <w:spacing w:after="0"/>
+        <w:jc w:val="both"/>
+        <w:rPr>
+          <w:rFonts w:ascii="Times New Roman" w:hAnsi="Times New Roman" w:cs="Times New Roman"/>
+          <w:b/>
+          <w:bCs/>
+          <w:lang w:val="en-US"/>
+        </w:rPr>
+      </w:pPr>
+      <w:r>
+        <w:rPr>
+          <w:rFonts w:ascii="Times New Roman" w:hAnsi="Times New Roman" w:cs="Times New Roman"/>
+          <w:noProof/>
+          <w:lang w:val="en-US"/>
+        </w:rPr>
+        <w:drawing>
+          <wp:anchor distT="0" distB="0" distL="114300" distR="114300" simplePos="0" relativeHeight="251659264" behindDoc="1" locked="0" layoutInCell="1" allowOverlap="1" wp14:anchorId="38B1D373" wp14:editId="1909C802">
+            <wp:simplePos x="0" y="0"/>
+            <wp:positionH relativeFrom="column">
+              <wp:posOffset>-166238</wp:posOffset>
+            </wp:positionH>
+            <wp:positionV relativeFrom="paragraph">
+              <wp:posOffset>20171</wp:posOffset>
+            </wp:positionV>
+            <wp:extent cx="2830830" cy="1988820"/>
+            <wp:effectExtent l="0" t="0" r="7620" b="0"/>
+            <wp:wrapTight wrapText="bothSides">
+              <wp:wrapPolygon edited="0">
+                <wp:start x="0" y="0"/>
+                <wp:lineTo x="0" y="21310"/>
+                <wp:lineTo x="21513" y="21310"/>
+                <wp:lineTo x="21513" y="0"/>
+                <wp:lineTo x="0" y="0"/>
+              </wp:wrapPolygon>
+            </wp:wrapTight>
+            <wp:docPr id="5" name="Picture 5" descr="C:\Users\CODEZ\Downloads\26.png"/>
+            <wp:cNvGraphicFramePr>
+              <a:graphicFrameLocks xmlns:a="http://schemas.openxmlformats.org/drawingml/2006/main" noChangeAspect="1"/>
+            </wp:cNvGraphicFramePr>
+            <a:graphic xmlns:a="http://schemas.openxmlformats.org/drawingml/2006/main">
+              <a:graphicData uri="http://schemas.openxmlformats.org/drawingml/2006/picture">
+                <pic:pic xmlns:pic="http://schemas.openxmlformats.org/drawingml/2006/picture">
+                  <pic:nvPicPr>
+                    <pic:cNvPr id="0" name="Picture 4" descr="C:\Users\CODEZ\Downloads\26.png"/>
+                    <pic:cNvPicPr>
+                      <a:picLocks noChangeAspect="1" noChangeArrowheads="1"/>
+                    </pic:cNvPicPr>
+                  </pic:nvPicPr>
+                  <pic:blipFill rotWithShape="1">
+                    <a:blip r:embed="rId6" cstate="print">
+                      <a:extLst>
+                        <a:ext uri="{28A0092B-C50C-407E-A947-70E740481C1C}">
+                          <a14:useLocalDpi xmlns:a14="http://schemas.microsoft.com/office/drawing/2010/main" val="0"/>
+                        </a:ext>
+                      </a:extLst>
+                    </a:blip>
+                    <a:srcRect l="7254" r="43325" b="13872"/>
+                    <a:stretch/>
+                  </pic:blipFill>
+                  <pic:spPr bwMode="auto">
+                    <a:xfrm>
+                      <a:off x="0" y="0"/>
+                      <a:ext cx="2830830" cy="1988820"/>
+                    </a:xfrm>
+                    <a:prstGeom prst="rect">
+                      <a:avLst/>
+                    </a:prstGeom>
+                    <a:noFill/>
+                    <a:ln>
+                      <a:noFill/>
+                    </a:ln>
+                    <a:extLst>
+                      <a:ext uri="{53640926-AAD7-44D8-BBD7-CCE9431645EC}">
+                        <a14:shadowObscured xmlns:a14="http://schemas.microsoft.com/office/drawing/2010/main"/>
+                      </a:ext>
+                    </a:extLst>
+                  </pic:spPr>
+                </pic:pic>
+              </a:graphicData>
+            </a:graphic>
+            <wp14:sizeRelH relativeFrom="page">
+              <wp14:pctWidth>0</wp14:pctWidth>
+            </wp14:sizeRelH>
+            <wp14:sizeRelV relativeFrom="page">
+              <wp14:pctHeight>0</wp14:pctHeight>
+            </wp14:sizeRelV>
+          </wp:anchor>
+        </w:drawing>
+      </w:r>
+      <w:r>
+        <w:rPr>
+          <w:rFonts w:ascii="Times New Roman" w:hAnsi="Times New Roman" w:cs="Times New Roman"/>
           <w:b/>
           <w:bCs/>
           <w:lang w:val="en-US"/>
@@ -1482,6 +1562,109 @@
     </w:p>
     <w:p>
       <w:pPr>
+        <w:spacing w:after="0"/>
+        <w:jc w:val="both"/>
+        <w:rPr>
+          <w:rFonts w:ascii="Times New Roman" w:hAnsi="Times New Roman" w:cs="Times New Roman"/>
+          <w:lang w:val="en-US"/>
+        </w:rPr>
+      </w:pPr>
+      <w:r>
+        <w:rPr>
+          <w:rFonts w:ascii="Times New Roman" w:hAnsi="Times New Roman" w:cs="Times New Roman"/>
+          <w:lang w:val="en-US"/>
+        </w:rPr>
+        <w:t>We started an experiment by selecting the project profile and choosing the Lab 0. We named the experiment using our group ID</w:t>
+      </w:r>
+      <w:r>
+        <w:rPr>
+          <w:rFonts w:ascii="Times New Roman" w:hAnsi="Times New Roman" w:cs="Times New Roman"/>
+          <w:lang w:val="en-US"/>
+        </w:rPr>
+        <w:t xml:space="preserve"> ‘</w:t>
+      </w:r>
+      <w:proofErr w:type="spellStart"/>
+      <w:r>
+        <w:rPr>
+          <w:rFonts w:ascii="Times New Roman" w:hAnsi="Times New Roman" w:cs="Times New Roman"/>
+          <w:lang w:val="en-US"/>
+        </w:rPr>
+        <w:t>daz</w:t>
+      </w:r>
+      <w:proofErr w:type="spellEnd"/>
+      <w:r>
+        <w:rPr>
+          <w:rFonts w:ascii="Times New Roman" w:hAnsi="Times New Roman" w:cs="Times New Roman"/>
+          <w:lang w:val="en-US"/>
+        </w:rPr>
+        <w:t>’ and selected Utah cluster. After a few minutes, then experiment was successfully created.</w:t>
+      </w:r>
+    </w:p>
+    <w:p>
+      <w:pPr>
+        <w:spacing w:after="0"/>
+        <w:jc w:val="both"/>
+        <w:rPr>
+          <w:rFonts w:ascii="Times New Roman" w:hAnsi="Times New Roman" w:cs="Times New Roman"/>
+          <w:lang w:val="en-US"/>
+        </w:rPr>
+      </w:pPr>
+      <w:r>
+        <w:rPr>
+          <w:rFonts w:ascii="Times New Roman" w:hAnsi="Times New Roman" w:cs="Times New Roman"/>
+          <w:lang w:val="en-US"/>
+        </w:rPr>
+        <w:t>The system automatically provided client and server machines. We accessed these machines using SSH commands provided on the dashboard once their status showed “Finished.”</w:t>
+      </w:r>
+    </w:p>
+    <w:p>
+      <w:pPr>
+        <w:spacing w:after="0"/>
+        <w:jc w:val="both"/>
+        <w:rPr>
+          <w:rFonts w:ascii="Times New Roman" w:hAnsi="Times New Roman" w:cs="Times New Roman"/>
+          <w:lang w:val="en-US"/>
+        </w:rPr>
+      </w:pPr>
+    </w:p>
+    <w:p>
+      <w:pPr>
+        <w:spacing w:after="0"/>
+        <w:jc w:val="both"/>
+        <w:rPr>
+          <w:rFonts w:ascii="Times New Roman" w:hAnsi="Times New Roman" w:cs="Times New Roman"/>
+          <w:b/>
+          <w:bCs/>
+          <w:lang w:val="en-US"/>
+        </w:rPr>
+      </w:pPr>
+    </w:p>
+    <w:p>
+      <w:pPr>
+        <w:rPr>
+          <w:lang w:val="en-US"/>
+        </w:rPr>
+      </w:pPr>
+    </w:p>
+    <w:p>
+      <w:pPr>
+        <w:rPr>
+          <w:b/>
+          <w:bCs/>
+          <w:lang w:val="en-US"/>
+        </w:rPr>
+      </w:pPr>
+      <w:r>
+        <w:rPr>
+          <w:b/>
+          <w:bCs/>
+          <w:lang w:val="en-US"/>
+        </w:rPr>
+        <w:t>Starting an Experiment</w:t>
+      </w:r>
+    </w:p>
+    <w:p>
+      <w:pPr>
         <w:rPr>
           <w:lang w:val="en-US"/>
         </w:rPr>
@@ -1503,6 +1686,7 @@
         <w:rPr>
           <w:lang w:val="en-US"/>
         </w:rPr>
+        <w:lastRenderedPageBreak/>
         <w:t>The system automatically provided client and server machines. We accessed these machines using SSH commands provided on the dashboard once their status showed “Finished.”</w:t>
       </w:r>
     </w:p>
@@ -1553,7 +1737,6 @@
         <w:rPr>
           <w:lang w:val="en-US"/>
         </w:rPr>
-        <w:lastRenderedPageBreak/>
         <w:t>We used commands like ssh-agent, ssh-add, and ssh -A to enable secure and smooth access across all nodes.</w:t>
       </w:r>
     </w:p>

</xml_diff>